<commit_message>
KTVTKPM Labs: (Tuan 04) Docker labs : done
</commit_message>
<xml_diff>
--- a/Tuan04/NguyenHuynhMinhHieu_22671131.docx
+++ b/Tuan04/NguyenHuynhMinhHieu_22671131.docx
@@ -1,14 +1,780 @@
 
 <file path=word/document.xml><?xml version="1.0" encoding="utf-8"?>
-<w:document xmlns:wpc="http://schemas.microsoft.com/office/word/2010/wordprocessingCanvas" xmlns:mc="http://schemas.openxmlformats.org/markup-compatibility/2006" xmlns:o="urn:schemas-microsoft-com:office:office" xmlns:r="http://schemas.openxmlformats.org/officeDocument/2006/relationships" xmlns:m="http://schemas.openxmlformats.org/officeDocument/2006/math" xmlns:v="urn:schemas-microsoft-com:vml" xmlns:wp14="http://schemas.microsoft.com/office/word/2010/wordprocessingDrawing" xmlns:wp="http://schemas.openxmlformats.org/drawingml/2006/wordprocessingDrawing" xmlns:w10="urn:schemas-microsoft-com:office:word" xmlns:w="http://schemas.openxmlformats.org/wordprocessingml/2006/main" xmlns:w14="http://schemas.microsoft.com/office/word/2010/wordml" xmlns:w15="http://schemas.microsoft.com/office/word/2012/wordml" xmlns:wpg="http://schemas.microsoft.com/office/word/2010/wordprocessingGroup" xmlns:wpi="http://schemas.microsoft.com/office/word/2010/wordprocessingInk" xmlns:wne="http://schemas.microsoft.com/office/word/2006/wordml" xmlns:wps="http://schemas.microsoft.com/office/word/2010/wordprocessingShape" mc:Ignorable="w14 w15 wp14">
+<w:document xmlns:wpc="http://schemas.microsoft.com/office/word/2010/wordprocessingCanvas" xmlns:cx="http://schemas.microsoft.com/office/drawing/2014/chartex" xmlns:mc="http://schemas.openxmlformats.org/markup-compatibility/2006" xmlns:o="urn:schemas-microsoft-com:office:office" xmlns:r="http://schemas.openxmlformats.org/officeDocument/2006/relationships" xmlns:m="http://schemas.openxmlformats.org/officeDocument/2006/math" xmlns:v="urn:schemas-microsoft-com:vml" xmlns:wp14="http://schemas.microsoft.com/office/word/2010/wordprocessingDrawing" xmlns:wp="http://schemas.openxmlformats.org/drawingml/2006/wordprocessingDrawing" xmlns:w10="urn:schemas-microsoft-com:office:word" xmlns:w="http://schemas.openxmlformats.org/wordprocessingml/2006/main" xmlns:w14="http://schemas.microsoft.com/office/word/2010/wordml" xmlns:w15="http://schemas.microsoft.com/office/word/2012/wordml" xmlns:w16se="http://schemas.microsoft.com/office/word/2015/wordml/symex" xmlns:wpg="http://schemas.microsoft.com/office/word/2010/wordprocessingGroup" xmlns:wpi="http://schemas.microsoft.com/office/word/2010/wordprocessingInk" xmlns:wne="http://schemas.microsoft.com/office/word/2006/wordml" xmlns:wps="http://schemas.microsoft.com/office/word/2010/wordprocessingShape" mc:Ignorable="w14 w15 w16se wp14">
   <w:body>
     <w:p>
-      <w:r>
-        <w:t>Nguyen Huynh Minh Hieu - 22671131</w:t>
-      </w:r>
+      <w:proofErr w:type="spellStart"/>
+      <w:r>
+        <w:t>Nguyễn</w:t>
+      </w:r>
+      <w:proofErr w:type="spellEnd"/>
+      <w:r>
+        <w:t xml:space="preserve"> </w:t>
+      </w:r>
+      <w:proofErr w:type="spellStart"/>
+      <w:r>
+        <w:t>Huỳnh</w:t>
+      </w:r>
+      <w:proofErr w:type="spellEnd"/>
+      <w:r>
+        <w:t xml:space="preserve"> Minh </w:t>
+      </w:r>
+      <w:proofErr w:type="spellStart"/>
+      <w:r>
+        <w:t>Hiếu</w:t>
+      </w:r>
+      <w:proofErr w:type="spellEnd"/>
+      <w:r>
+        <w:t xml:space="preserve"> </w:t>
+      </w:r>
+      <w:r>
+        <w:t>–</w:t>
+      </w:r>
+      <w:r>
+        <w:t xml:space="preserve"> 22671131</w:t>
+      </w:r>
+    </w:p>
+    <w:p>
+      <w:proofErr w:type="spellStart"/>
+      <w:r>
+        <w:t>Phần</w:t>
+      </w:r>
+      <w:proofErr w:type="spellEnd"/>
+      <w:r>
+        <w:t xml:space="preserve"> </w:t>
+      </w:r>
+      <w:proofErr w:type="gramStart"/>
+      <w:r>
+        <w:t>1 :</w:t>
+      </w:r>
+      <w:proofErr w:type="gramEnd"/>
+    </w:p>
+    <w:p>
+      <w:r>
+        <w:drawing>
+          <wp:inline distT="0" distB="0" distL="0" distR="0" wp14:anchorId="7E1A1DBA" wp14:editId="59E9C601">
+            <wp:extent cx="5943600" cy="3134360"/>
+            <wp:effectExtent l="0" t="0" r="0" b="8890"/>
+            <wp:docPr id="4" name="Picture 4"/>
+            <wp:cNvGraphicFramePr>
+              <a:graphicFrameLocks xmlns:a="http://schemas.openxmlformats.org/drawingml/2006/main" noChangeAspect="1"/>
+            </wp:cNvGraphicFramePr>
+            <a:graphic xmlns:a="http://schemas.openxmlformats.org/drawingml/2006/main">
+              <a:graphicData uri="http://schemas.openxmlformats.org/drawingml/2006/picture">
+                <pic:pic xmlns:pic="http://schemas.openxmlformats.org/drawingml/2006/picture">
+                  <pic:nvPicPr>
+                    <pic:cNvPr id="1" name=""/>
+                    <pic:cNvPicPr/>
+                  </pic:nvPicPr>
+                  <pic:blipFill>
+                    <a:blip r:embed="rId4"/>
+                    <a:stretch>
+                      <a:fillRect/>
+                    </a:stretch>
+                  </pic:blipFill>
+                  <pic:spPr>
+                    <a:xfrm>
+                      <a:off x="0" y="0"/>
+                      <a:ext cx="5943600" cy="3134360"/>
+                    </a:xfrm>
+                    <a:prstGeom prst="rect">
+                      <a:avLst/>
+                    </a:prstGeom>
+                  </pic:spPr>
+                </pic:pic>
+              </a:graphicData>
+            </a:graphic>
+          </wp:inline>
+        </w:drawing>
+      </w:r>
+    </w:p>
+    <w:p>
+      <w:r>
+        <w:drawing>
+          <wp:inline distT="0" distB="0" distL="0" distR="0" wp14:anchorId="08EAF4A6" wp14:editId="6C22CE69">
+            <wp:extent cx="5943600" cy="1135380"/>
+            <wp:effectExtent l="0" t="0" r="0" b="7620"/>
+            <wp:docPr id="5" name="Picture 5"/>
+            <wp:cNvGraphicFramePr>
+              <a:graphicFrameLocks xmlns:a="http://schemas.openxmlformats.org/drawingml/2006/main" noChangeAspect="1"/>
+            </wp:cNvGraphicFramePr>
+            <a:graphic xmlns:a="http://schemas.openxmlformats.org/drawingml/2006/main">
+              <a:graphicData uri="http://schemas.openxmlformats.org/drawingml/2006/picture">
+                <pic:pic xmlns:pic="http://schemas.openxmlformats.org/drawingml/2006/picture">
+                  <pic:nvPicPr>
+                    <pic:cNvPr id="1" name=""/>
+                    <pic:cNvPicPr/>
+                  </pic:nvPicPr>
+                  <pic:blipFill>
+                    <a:blip r:embed="rId5"/>
+                    <a:stretch>
+                      <a:fillRect/>
+                    </a:stretch>
+                  </pic:blipFill>
+                  <pic:spPr>
+                    <a:xfrm>
+                      <a:off x="0" y="0"/>
+                      <a:ext cx="5943600" cy="1135380"/>
+                    </a:xfrm>
+                    <a:prstGeom prst="rect">
+                      <a:avLst/>
+                    </a:prstGeom>
+                  </pic:spPr>
+                </pic:pic>
+              </a:graphicData>
+            </a:graphic>
+          </wp:inline>
+        </w:drawing>
+      </w:r>
+      <w:r>
+        <w:drawing>
+          <wp:inline distT="0" distB="0" distL="0" distR="0" wp14:anchorId="03A3A665" wp14:editId="3CD7F0F0">
+            <wp:extent cx="5943600" cy="1117600"/>
+            <wp:effectExtent l="0" t="0" r="0" b="6350"/>
+            <wp:docPr id="6" name="Picture 6"/>
+            <wp:cNvGraphicFramePr>
+              <a:graphicFrameLocks xmlns:a="http://schemas.openxmlformats.org/drawingml/2006/main" noChangeAspect="1"/>
+            </wp:cNvGraphicFramePr>
+            <a:graphic xmlns:a="http://schemas.openxmlformats.org/drawingml/2006/main">
+              <a:graphicData uri="http://schemas.openxmlformats.org/drawingml/2006/picture">
+                <pic:pic xmlns:pic="http://schemas.openxmlformats.org/drawingml/2006/picture">
+                  <pic:nvPicPr>
+                    <pic:cNvPr id="1" name=""/>
+                    <pic:cNvPicPr/>
+                  </pic:nvPicPr>
+                  <pic:blipFill>
+                    <a:blip r:embed="rId6"/>
+                    <a:stretch>
+                      <a:fillRect/>
+                    </a:stretch>
+                  </pic:blipFill>
+                  <pic:spPr>
+                    <a:xfrm>
+                      <a:off x="0" y="0"/>
+                      <a:ext cx="5943600" cy="1117600"/>
+                    </a:xfrm>
+                    <a:prstGeom prst="rect">
+                      <a:avLst/>
+                    </a:prstGeom>
+                  </pic:spPr>
+                </pic:pic>
+              </a:graphicData>
+            </a:graphic>
+          </wp:inline>
+        </w:drawing>
+      </w:r>
+      <w:r>
+        <w:lastRenderedPageBreak/>
+        <w:drawing>
+          <wp:inline distT="0" distB="0" distL="0" distR="0" wp14:anchorId="5D876BC7" wp14:editId="6F547E22">
+            <wp:extent cx="5943600" cy="2114550"/>
+            <wp:effectExtent l="0" t="0" r="0" b="0"/>
+            <wp:docPr id="7" name="Picture 7"/>
+            <wp:cNvGraphicFramePr>
+              <a:graphicFrameLocks xmlns:a="http://schemas.openxmlformats.org/drawingml/2006/main" noChangeAspect="1"/>
+            </wp:cNvGraphicFramePr>
+            <a:graphic xmlns:a="http://schemas.openxmlformats.org/drawingml/2006/main">
+              <a:graphicData uri="http://schemas.openxmlformats.org/drawingml/2006/picture">
+                <pic:pic xmlns:pic="http://schemas.openxmlformats.org/drawingml/2006/picture">
+                  <pic:nvPicPr>
+                    <pic:cNvPr id="1" name=""/>
+                    <pic:cNvPicPr/>
+                  </pic:nvPicPr>
+                  <pic:blipFill>
+                    <a:blip r:embed="rId7"/>
+                    <a:stretch>
+                      <a:fillRect/>
+                    </a:stretch>
+                  </pic:blipFill>
+                  <pic:spPr>
+                    <a:xfrm>
+                      <a:off x="0" y="0"/>
+                      <a:ext cx="5943600" cy="2114550"/>
+                    </a:xfrm>
+                    <a:prstGeom prst="rect">
+                      <a:avLst/>
+                    </a:prstGeom>
+                  </pic:spPr>
+                </pic:pic>
+              </a:graphicData>
+            </a:graphic>
+          </wp:inline>
+        </w:drawing>
+      </w:r>
+      <w:r>
+        <w:drawing>
+          <wp:inline distT="0" distB="0" distL="0" distR="0" wp14:anchorId="7157531A" wp14:editId="25D4091D">
+            <wp:extent cx="5943600" cy="869315"/>
+            <wp:effectExtent l="0" t="0" r="0" b="6985"/>
+            <wp:docPr id="8" name="Picture 8"/>
+            <wp:cNvGraphicFramePr>
+              <a:graphicFrameLocks xmlns:a="http://schemas.openxmlformats.org/drawingml/2006/main" noChangeAspect="1"/>
+            </wp:cNvGraphicFramePr>
+            <a:graphic xmlns:a="http://schemas.openxmlformats.org/drawingml/2006/main">
+              <a:graphicData uri="http://schemas.openxmlformats.org/drawingml/2006/picture">
+                <pic:pic xmlns:pic="http://schemas.openxmlformats.org/drawingml/2006/picture">
+                  <pic:nvPicPr>
+                    <pic:cNvPr id="1" name=""/>
+                    <pic:cNvPicPr/>
+                  </pic:nvPicPr>
+                  <pic:blipFill>
+                    <a:blip r:embed="rId8"/>
+                    <a:stretch>
+                      <a:fillRect/>
+                    </a:stretch>
+                  </pic:blipFill>
+                  <pic:spPr>
+                    <a:xfrm>
+                      <a:off x="0" y="0"/>
+                      <a:ext cx="5943600" cy="869315"/>
+                    </a:xfrm>
+                    <a:prstGeom prst="rect">
+                      <a:avLst/>
+                    </a:prstGeom>
+                  </pic:spPr>
+                </pic:pic>
+              </a:graphicData>
+            </a:graphic>
+          </wp:inline>
+        </w:drawing>
+      </w:r>
+      <w:r>
+        <w:drawing>
+          <wp:inline distT="0" distB="0" distL="0" distR="0" wp14:anchorId="3AF9FAB5" wp14:editId="7FF14699">
+            <wp:extent cx="5943600" cy="2093595"/>
+            <wp:effectExtent l="0" t="0" r="0" b="1905"/>
+            <wp:docPr id="9" name="Picture 9"/>
+            <wp:cNvGraphicFramePr>
+              <a:graphicFrameLocks xmlns:a="http://schemas.openxmlformats.org/drawingml/2006/main" noChangeAspect="1"/>
+            </wp:cNvGraphicFramePr>
+            <a:graphic xmlns:a="http://schemas.openxmlformats.org/drawingml/2006/main">
+              <a:graphicData uri="http://schemas.openxmlformats.org/drawingml/2006/picture">
+                <pic:pic xmlns:pic="http://schemas.openxmlformats.org/drawingml/2006/picture">
+                  <pic:nvPicPr>
+                    <pic:cNvPr id="1" name=""/>
+                    <pic:cNvPicPr/>
+                  </pic:nvPicPr>
+                  <pic:blipFill>
+                    <a:blip r:embed="rId9"/>
+                    <a:stretch>
+                      <a:fillRect/>
+                    </a:stretch>
+                  </pic:blipFill>
+                  <pic:spPr>
+                    <a:xfrm>
+                      <a:off x="0" y="0"/>
+                      <a:ext cx="5943600" cy="2093595"/>
+                    </a:xfrm>
+                    <a:prstGeom prst="rect">
+                      <a:avLst/>
+                    </a:prstGeom>
+                  </pic:spPr>
+                </pic:pic>
+              </a:graphicData>
+            </a:graphic>
+          </wp:inline>
+        </w:drawing>
+      </w:r>
+      <w:r>
+        <w:drawing>
+          <wp:inline distT="0" distB="0" distL="0" distR="0" wp14:anchorId="09CEF04F" wp14:editId="637EC753">
+            <wp:extent cx="5943600" cy="2854960"/>
+            <wp:effectExtent l="0" t="0" r="0" b="2540"/>
+            <wp:docPr id="10" name="Picture 10"/>
+            <wp:cNvGraphicFramePr>
+              <a:graphicFrameLocks xmlns:a="http://schemas.openxmlformats.org/drawingml/2006/main" noChangeAspect="1"/>
+            </wp:cNvGraphicFramePr>
+            <a:graphic xmlns:a="http://schemas.openxmlformats.org/drawingml/2006/main">
+              <a:graphicData uri="http://schemas.openxmlformats.org/drawingml/2006/picture">
+                <pic:pic xmlns:pic="http://schemas.openxmlformats.org/drawingml/2006/picture">
+                  <pic:nvPicPr>
+                    <pic:cNvPr id="1" name=""/>
+                    <pic:cNvPicPr/>
+                  </pic:nvPicPr>
+                  <pic:blipFill>
+                    <a:blip r:embed="rId10"/>
+                    <a:stretch>
+                      <a:fillRect/>
+                    </a:stretch>
+                  </pic:blipFill>
+                  <pic:spPr>
+                    <a:xfrm>
+                      <a:off x="0" y="0"/>
+                      <a:ext cx="5943600" cy="2854960"/>
+                    </a:xfrm>
+                    <a:prstGeom prst="rect">
+                      <a:avLst/>
+                    </a:prstGeom>
+                  </pic:spPr>
+                </pic:pic>
+              </a:graphicData>
+            </a:graphic>
+          </wp:inline>
+        </w:drawing>
+      </w:r>
+      <w:r>
+        <w:lastRenderedPageBreak/>
+        <w:drawing>
+          <wp:inline distT="0" distB="0" distL="0" distR="0" wp14:anchorId="26A7C3A4" wp14:editId="27F5D8A9">
+            <wp:extent cx="5943600" cy="4057015"/>
+            <wp:effectExtent l="0" t="0" r="0" b="635"/>
+            <wp:docPr id="11" name="Picture 11"/>
+            <wp:cNvGraphicFramePr>
+              <a:graphicFrameLocks xmlns:a="http://schemas.openxmlformats.org/drawingml/2006/main" noChangeAspect="1"/>
+            </wp:cNvGraphicFramePr>
+            <a:graphic xmlns:a="http://schemas.openxmlformats.org/drawingml/2006/main">
+              <a:graphicData uri="http://schemas.openxmlformats.org/drawingml/2006/picture">
+                <pic:pic xmlns:pic="http://schemas.openxmlformats.org/drawingml/2006/picture">
+                  <pic:nvPicPr>
+                    <pic:cNvPr id="1" name=""/>
+                    <pic:cNvPicPr/>
+                  </pic:nvPicPr>
+                  <pic:blipFill>
+                    <a:blip r:embed="rId11"/>
+                    <a:stretch>
+                      <a:fillRect/>
+                    </a:stretch>
+                  </pic:blipFill>
+                  <pic:spPr>
+                    <a:xfrm>
+                      <a:off x="0" y="0"/>
+                      <a:ext cx="5943600" cy="4057015"/>
+                    </a:xfrm>
+                    <a:prstGeom prst="rect">
+                      <a:avLst/>
+                    </a:prstGeom>
+                  </pic:spPr>
+                </pic:pic>
+              </a:graphicData>
+            </a:graphic>
+          </wp:inline>
+        </w:drawing>
+      </w:r>
+      <w:r>
+        <w:drawing>
+          <wp:inline distT="0" distB="0" distL="0" distR="0" wp14:anchorId="7F2B11A4" wp14:editId="2797B30F">
+            <wp:extent cx="5943600" cy="508635"/>
+            <wp:effectExtent l="0" t="0" r="0" b="5715"/>
+            <wp:docPr id="12" name="Picture 12"/>
+            <wp:cNvGraphicFramePr>
+              <a:graphicFrameLocks xmlns:a="http://schemas.openxmlformats.org/drawingml/2006/main" noChangeAspect="1"/>
+            </wp:cNvGraphicFramePr>
+            <a:graphic xmlns:a="http://schemas.openxmlformats.org/drawingml/2006/main">
+              <a:graphicData uri="http://schemas.openxmlformats.org/drawingml/2006/picture">
+                <pic:pic xmlns:pic="http://schemas.openxmlformats.org/drawingml/2006/picture">
+                  <pic:nvPicPr>
+                    <pic:cNvPr id="1" name=""/>
+                    <pic:cNvPicPr/>
+                  </pic:nvPicPr>
+                  <pic:blipFill>
+                    <a:blip r:embed="rId12"/>
+                    <a:stretch>
+                      <a:fillRect/>
+                    </a:stretch>
+                  </pic:blipFill>
+                  <pic:spPr>
+                    <a:xfrm>
+                      <a:off x="0" y="0"/>
+                      <a:ext cx="5943600" cy="508635"/>
+                    </a:xfrm>
+                    <a:prstGeom prst="rect">
+                      <a:avLst/>
+                    </a:prstGeom>
+                  </pic:spPr>
+                </pic:pic>
+              </a:graphicData>
+            </a:graphic>
+          </wp:inline>
+        </w:drawing>
+      </w:r>
+      <w:r>
+        <w:drawing>
+          <wp:inline distT="0" distB="0" distL="0" distR="0" wp14:anchorId="38B98594" wp14:editId="549A8684">
+            <wp:extent cx="5943600" cy="302895"/>
+            <wp:effectExtent l="0" t="0" r="0" b="1905"/>
+            <wp:docPr id="13" name="Picture 13"/>
+            <wp:cNvGraphicFramePr>
+              <a:graphicFrameLocks xmlns:a="http://schemas.openxmlformats.org/drawingml/2006/main" noChangeAspect="1"/>
+            </wp:cNvGraphicFramePr>
+            <a:graphic xmlns:a="http://schemas.openxmlformats.org/drawingml/2006/main">
+              <a:graphicData uri="http://schemas.openxmlformats.org/drawingml/2006/picture">
+                <pic:pic xmlns:pic="http://schemas.openxmlformats.org/drawingml/2006/picture">
+                  <pic:nvPicPr>
+                    <pic:cNvPr id="1" name=""/>
+                    <pic:cNvPicPr/>
+                  </pic:nvPicPr>
+                  <pic:blipFill>
+                    <a:blip r:embed="rId13"/>
+                    <a:stretch>
+                      <a:fillRect/>
+                    </a:stretch>
+                  </pic:blipFill>
+                  <pic:spPr>
+                    <a:xfrm>
+                      <a:off x="0" y="0"/>
+                      <a:ext cx="5943600" cy="302895"/>
+                    </a:xfrm>
+                    <a:prstGeom prst="rect">
+                      <a:avLst/>
+                    </a:prstGeom>
+                  </pic:spPr>
+                </pic:pic>
+              </a:graphicData>
+            </a:graphic>
+          </wp:inline>
+        </w:drawing>
+      </w:r>
+      <w:r>
+        <w:drawing>
+          <wp:inline distT="0" distB="0" distL="0" distR="0" wp14:anchorId="3B1A4232" wp14:editId="77DC7DCD">
+            <wp:extent cx="5943600" cy="358140"/>
+            <wp:effectExtent l="0" t="0" r="0" b="3810"/>
+            <wp:docPr id="14" name="Picture 14"/>
+            <wp:cNvGraphicFramePr>
+              <a:graphicFrameLocks xmlns:a="http://schemas.openxmlformats.org/drawingml/2006/main" noChangeAspect="1"/>
+            </wp:cNvGraphicFramePr>
+            <a:graphic xmlns:a="http://schemas.openxmlformats.org/drawingml/2006/main">
+              <a:graphicData uri="http://schemas.openxmlformats.org/drawingml/2006/picture">
+                <pic:pic xmlns:pic="http://schemas.openxmlformats.org/drawingml/2006/picture">
+                  <pic:nvPicPr>
+                    <pic:cNvPr id="1" name=""/>
+                    <pic:cNvPicPr/>
+                  </pic:nvPicPr>
+                  <pic:blipFill>
+                    <a:blip r:embed="rId14"/>
+                    <a:stretch>
+                      <a:fillRect/>
+                    </a:stretch>
+                  </pic:blipFill>
+                  <pic:spPr>
+                    <a:xfrm>
+                      <a:off x="0" y="0"/>
+                      <a:ext cx="5943600" cy="358140"/>
+                    </a:xfrm>
+                    <a:prstGeom prst="rect">
+                      <a:avLst/>
+                    </a:prstGeom>
+                  </pic:spPr>
+                </pic:pic>
+              </a:graphicData>
+            </a:graphic>
+          </wp:inline>
+        </w:drawing>
+      </w:r>
+      <w:r>
+        <w:drawing>
+          <wp:inline distT="0" distB="0" distL="0" distR="0" wp14:anchorId="183892CE" wp14:editId="4DB2AA45">
+            <wp:extent cx="5943600" cy="342900"/>
+            <wp:effectExtent l="0" t="0" r="0" b="0"/>
+            <wp:docPr id="15" name="Picture 15"/>
+            <wp:cNvGraphicFramePr>
+              <a:graphicFrameLocks xmlns:a="http://schemas.openxmlformats.org/drawingml/2006/main" noChangeAspect="1"/>
+            </wp:cNvGraphicFramePr>
+            <a:graphic xmlns:a="http://schemas.openxmlformats.org/drawingml/2006/main">
+              <a:graphicData uri="http://schemas.openxmlformats.org/drawingml/2006/picture">
+                <pic:pic xmlns:pic="http://schemas.openxmlformats.org/drawingml/2006/picture">
+                  <pic:nvPicPr>
+                    <pic:cNvPr id="1" name=""/>
+                    <pic:cNvPicPr/>
+                  </pic:nvPicPr>
+                  <pic:blipFill>
+                    <a:blip r:embed="rId15"/>
+                    <a:stretch>
+                      <a:fillRect/>
+                    </a:stretch>
+                  </pic:blipFill>
+                  <pic:spPr>
+                    <a:xfrm>
+                      <a:off x="0" y="0"/>
+                      <a:ext cx="5943600" cy="342900"/>
+                    </a:xfrm>
+                    <a:prstGeom prst="rect">
+                      <a:avLst/>
+                    </a:prstGeom>
+                  </pic:spPr>
+                </pic:pic>
+              </a:graphicData>
+            </a:graphic>
+          </wp:inline>
+        </w:drawing>
+      </w:r>
+      <w:r>
+        <w:drawing>
+          <wp:inline distT="0" distB="0" distL="0" distR="0" wp14:anchorId="39A521D6" wp14:editId="388DC6C6">
+            <wp:extent cx="5943600" cy="520065"/>
+            <wp:effectExtent l="0" t="0" r="0" b="0"/>
+            <wp:docPr id="16" name="Picture 16"/>
+            <wp:cNvGraphicFramePr>
+              <a:graphicFrameLocks xmlns:a="http://schemas.openxmlformats.org/drawingml/2006/main" noChangeAspect="1"/>
+            </wp:cNvGraphicFramePr>
+            <a:graphic xmlns:a="http://schemas.openxmlformats.org/drawingml/2006/main">
+              <a:graphicData uri="http://schemas.openxmlformats.org/drawingml/2006/picture">
+                <pic:pic xmlns:pic="http://schemas.openxmlformats.org/drawingml/2006/picture">
+                  <pic:nvPicPr>
+                    <pic:cNvPr id="1" name=""/>
+                    <pic:cNvPicPr/>
+                  </pic:nvPicPr>
+                  <pic:blipFill>
+                    <a:blip r:embed="rId16"/>
+                    <a:stretch>
+                      <a:fillRect/>
+                    </a:stretch>
+                  </pic:blipFill>
+                  <pic:spPr>
+                    <a:xfrm>
+                      <a:off x="0" y="0"/>
+                      <a:ext cx="5943600" cy="520065"/>
+                    </a:xfrm>
+                    <a:prstGeom prst="rect">
+                      <a:avLst/>
+                    </a:prstGeom>
+                  </pic:spPr>
+                </pic:pic>
+              </a:graphicData>
+            </a:graphic>
+          </wp:inline>
+        </w:drawing>
+      </w:r>
+      <w:r>
+        <w:drawing>
+          <wp:inline distT="0" distB="0" distL="0" distR="0" wp14:anchorId="3A0EAA6E" wp14:editId="5F4E8653">
+            <wp:extent cx="5943600" cy="432435"/>
+            <wp:effectExtent l="0" t="0" r="0" b="5715"/>
+            <wp:docPr id="17" name="Picture 17"/>
+            <wp:cNvGraphicFramePr>
+              <a:graphicFrameLocks xmlns:a="http://schemas.openxmlformats.org/drawingml/2006/main" noChangeAspect="1"/>
+            </wp:cNvGraphicFramePr>
+            <a:graphic xmlns:a="http://schemas.openxmlformats.org/drawingml/2006/main">
+              <a:graphicData uri="http://schemas.openxmlformats.org/drawingml/2006/picture">
+                <pic:pic xmlns:pic="http://schemas.openxmlformats.org/drawingml/2006/picture">
+                  <pic:nvPicPr>
+                    <pic:cNvPr id="1" name=""/>
+                    <pic:cNvPicPr/>
+                  </pic:nvPicPr>
+                  <pic:blipFill>
+                    <a:blip r:embed="rId17"/>
+                    <a:stretch>
+                      <a:fillRect/>
+                    </a:stretch>
+                  </pic:blipFill>
+                  <pic:spPr>
+                    <a:xfrm>
+                      <a:off x="0" y="0"/>
+                      <a:ext cx="5943600" cy="432435"/>
+                    </a:xfrm>
+                    <a:prstGeom prst="rect">
+                      <a:avLst/>
+                    </a:prstGeom>
+                  </pic:spPr>
+                </pic:pic>
+              </a:graphicData>
+            </a:graphic>
+          </wp:inline>
+        </w:drawing>
+      </w:r>
+    </w:p>
+    <w:p/>
+    <w:p>
+      <w:proofErr w:type="spellStart"/>
+      <w:r>
+        <w:t>Phần</w:t>
+      </w:r>
+      <w:proofErr w:type="spellEnd"/>
+      <w:r>
+        <w:t xml:space="preserve"> 2:</w:t>
+      </w:r>
+    </w:p>
+    <w:p>
+      <w:proofErr w:type="spellStart"/>
+      <w:r>
+        <w:t>Câu</w:t>
+      </w:r>
+      <w:proofErr w:type="spellEnd"/>
+      <w:r>
+        <w:t xml:space="preserve"> 1:</w:t>
+      </w:r>
+    </w:p>
+    <w:p>
+      <w:r>
+        <w:lastRenderedPageBreak/>
+        <w:drawing>
+          <wp:inline distT="0" distB="0" distL="0" distR="0" wp14:anchorId="714B4173" wp14:editId="32EA8FAA">
+            <wp:extent cx="5943600" cy="3342005"/>
+            <wp:effectExtent l="0" t="0" r="0" b="0"/>
+            <wp:docPr id="1" name="Picture 1"/>
+            <wp:cNvGraphicFramePr>
+              <a:graphicFrameLocks xmlns:a="http://schemas.openxmlformats.org/drawingml/2006/main" noChangeAspect="1"/>
+            </wp:cNvGraphicFramePr>
+            <a:graphic xmlns:a="http://schemas.openxmlformats.org/drawingml/2006/main">
+              <a:graphicData uri="http://schemas.openxmlformats.org/drawingml/2006/picture">
+                <pic:pic xmlns:pic="http://schemas.openxmlformats.org/drawingml/2006/picture">
+                  <pic:nvPicPr>
+                    <pic:cNvPr id="1" name=""/>
+                    <pic:cNvPicPr/>
+                  </pic:nvPicPr>
+                  <pic:blipFill>
+                    <a:blip r:embed="rId18"/>
+                    <a:stretch>
+                      <a:fillRect/>
+                    </a:stretch>
+                  </pic:blipFill>
+                  <pic:spPr>
+                    <a:xfrm>
+                      <a:off x="0" y="0"/>
+                      <a:ext cx="5943600" cy="3342005"/>
+                    </a:xfrm>
+                    <a:prstGeom prst="rect">
+                      <a:avLst/>
+                    </a:prstGeom>
+                  </pic:spPr>
+                </pic:pic>
+              </a:graphicData>
+            </a:graphic>
+          </wp:inline>
+        </w:drawing>
+      </w:r>
+    </w:p>
+    <w:p>
+      <w:r>
+        <w:drawing>
+          <wp:inline distT="0" distB="0" distL="0" distR="0" wp14:anchorId="606B4F2F" wp14:editId="332FC0C7">
+            <wp:extent cx="5943600" cy="2146300"/>
+            <wp:effectExtent l="0" t="0" r="0" b="6350"/>
+            <wp:docPr id="3" name="Picture 3"/>
+            <wp:cNvGraphicFramePr>
+              <a:graphicFrameLocks xmlns:a="http://schemas.openxmlformats.org/drawingml/2006/main" noChangeAspect="1"/>
+            </wp:cNvGraphicFramePr>
+            <a:graphic xmlns:a="http://schemas.openxmlformats.org/drawingml/2006/main">
+              <a:graphicData uri="http://schemas.openxmlformats.org/drawingml/2006/picture">
+                <pic:pic xmlns:pic="http://schemas.openxmlformats.org/drawingml/2006/picture">
+                  <pic:nvPicPr>
+                    <pic:cNvPr id="1" name=""/>
+                    <pic:cNvPicPr/>
+                  </pic:nvPicPr>
+                  <pic:blipFill>
+                    <a:blip r:embed="rId19"/>
+                    <a:stretch>
+                      <a:fillRect/>
+                    </a:stretch>
+                  </pic:blipFill>
+                  <pic:spPr>
+                    <a:xfrm>
+                      <a:off x="0" y="0"/>
+                      <a:ext cx="5943600" cy="2146300"/>
+                    </a:xfrm>
+                    <a:prstGeom prst="rect">
+                      <a:avLst/>
+                    </a:prstGeom>
+                  </pic:spPr>
+                </pic:pic>
+              </a:graphicData>
+            </a:graphic>
+          </wp:inline>
+        </w:drawing>
+      </w:r>
+    </w:p>
+    <w:p>
+      <w:proofErr w:type="spellStart"/>
+      <w:r>
+        <w:t>Câu</w:t>
+      </w:r>
+      <w:proofErr w:type="spellEnd"/>
+      <w:r>
+        <w:t xml:space="preserve"> 2:</w:t>
+      </w:r>
+    </w:p>
+    <w:p>
+      <w:r>
+        <w:lastRenderedPageBreak/>
+        <w:drawing>
+          <wp:inline distT="0" distB="0" distL="0" distR="0" wp14:anchorId="302F9872" wp14:editId="42AC2E85">
+            <wp:extent cx="5943600" cy="3279775"/>
+            <wp:effectExtent l="0" t="0" r="0" b="0"/>
+            <wp:docPr id="18" name="Picture 18"/>
+            <wp:cNvGraphicFramePr>
+              <a:graphicFrameLocks xmlns:a="http://schemas.openxmlformats.org/drawingml/2006/main" noChangeAspect="1"/>
+            </wp:cNvGraphicFramePr>
+            <a:graphic xmlns:a="http://schemas.openxmlformats.org/drawingml/2006/main">
+              <a:graphicData uri="http://schemas.openxmlformats.org/drawingml/2006/picture">
+                <pic:pic xmlns:pic="http://schemas.openxmlformats.org/drawingml/2006/picture">
+                  <pic:nvPicPr>
+                    <pic:cNvPr id="1" name=""/>
+                    <pic:cNvPicPr/>
+                  </pic:nvPicPr>
+                  <pic:blipFill>
+                    <a:blip r:embed="rId20"/>
+                    <a:stretch>
+                      <a:fillRect/>
+                    </a:stretch>
+                  </pic:blipFill>
+                  <pic:spPr>
+                    <a:xfrm>
+                      <a:off x="0" y="0"/>
+                      <a:ext cx="5943600" cy="3279775"/>
+                    </a:xfrm>
+                    <a:prstGeom prst="rect">
+                      <a:avLst/>
+                    </a:prstGeom>
+                  </pic:spPr>
+                </pic:pic>
+              </a:graphicData>
+            </a:graphic>
+          </wp:inline>
+        </w:drawing>
+      </w:r>
+      <w:r>
+        <w:drawing>
+          <wp:inline distT="0" distB="0" distL="0" distR="0" wp14:anchorId="483BF262" wp14:editId="607DDEAF">
+            <wp:extent cx="5943600" cy="2315845"/>
+            <wp:effectExtent l="0" t="0" r="0" b="8255"/>
+            <wp:docPr id="19" name="Picture 19"/>
+            <wp:cNvGraphicFramePr>
+              <a:graphicFrameLocks xmlns:a="http://schemas.openxmlformats.org/drawingml/2006/main" noChangeAspect="1"/>
+            </wp:cNvGraphicFramePr>
+            <a:graphic xmlns:a="http://schemas.openxmlformats.org/drawingml/2006/main">
+              <a:graphicData uri="http://schemas.openxmlformats.org/drawingml/2006/picture">
+                <pic:pic xmlns:pic="http://schemas.openxmlformats.org/drawingml/2006/picture">
+                  <pic:nvPicPr>
+                    <pic:cNvPr id="1" name=""/>
+                    <pic:cNvPicPr/>
+                  </pic:nvPicPr>
+                  <pic:blipFill>
+                    <a:blip r:embed="rId21"/>
+                    <a:stretch>
+                      <a:fillRect/>
+                    </a:stretch>
+                  </pic:blipFill>
+                  <pic:spPr>
+                    <a:xfrm>
+                      <a:off x="0" y="0"/>
+                      <a:ext cx="5943600" cy="2315845"/>
+                    </a:xfrm>
+                    <a:prstGeom prst="rect">
+                      <a:avLst/>
+                    </a:prstGeom>
+                  </pic:spPr>
+                </pic:pic>
+              </a:graphicData>
+            </a:graphic>
+          </wp:inline>
+        </w:drawing>
+      </w:r>
+    </w:p>
+    <w:p>
+      <w:proofErr w:type="spellStart"/>
+      <w:r>
+        <w:t>Câu</w:t>
+      </w:r>
+      <w:proofErr w:type="spellEnd"/>
+      <w:r>
+        <w:t xml:space="preserve"> 3:</w:t>
+      </w:r>
+    </w:p>
+    <w:p>
       <w:bookmarkStart w:id="0" w:name="_GoBack"/>
       <w:bookmarkEnd w:id="0"/>
     </w:p>
+    <w:p/>
     <w:sectPr>
       <w:pgSz w:w="12240" w:h="15840"/>
       <w:pgMar w:top="1440" w:right="1440" w:bottom="1440" w:left="1440" w:header="720" w:footer="720" w:gutter="0"/>
@@ -20,7 +786,7 @@
 </file>
 
 <file path=word/styles.xml><?xml version="1.0" encoding="utf-8"?>
-<w:styles xmlns:mc="http://schemas.openxmlformats.org/markup-compatibility/2006" xmlns:r="http://schemas.openxmlformats.org/officeDocument/2006/relationships" xmlns:w="http://schemas.openxmlformats.org/wordprocessingml/2006/main" xmlns:w14="http://schemas.microsoft.com/office/word/2010/wordml" xmlns:w15="http://schemas.microsoft.com/office/word/2012/wordml" mc:Ignorable="w14 w15">
+<w:styles xmlns:mc="http://schemas.openxmlformats.org/markup-compatibility/2006" xmlns:r="http://schemas.openxmlformats.org/officeDocument/2006/relationships" xmlns:w="http://schemas.openxmlformats.org/wordprocessingml/2006/main" xmlns:w14="http://schemas.microsoft.com/office/word/2010/wordml" xmlns:w15="http://schemas.microsoft.com/office/word/2012/wordml" xmlns:w16se="http://schemas.microsoft.com/office/word/2015/wordml/symex" mc:Ignorable="w14 w15 w16se">
   <w:docDefaults>
     <w:rPrDefault>
       <w:rPr>

</xml_diff>